<commit_message>
Translate section 7 and appendix to English; simplify deliverable to the Excel download; update simulator instructions
</commit_message>
<xml_diff>
--- a/Nomade_Vans_Case_v3.1_Simulator_Edition_2026-04-22.docx
+++ b/Nomade_Vans_Case_v3.1_Simulator_Edition_2026-04-22.docx
@@ -1383,7 +1383,7 @@
         <w:rPr>
           <w:color w:val="0F172A"/>
         </w:rPr>
-        <w:t>7. Criterios de evaluación · Evaluation criteria</w:t>
+        <w:t>7. Evaluation criteria</w:t>
       </w:r>
     </w:p>
     <w:p>
@@ -1391,7 +1391,7 @@
         <w:pStyle w:val="ListBullet"/>
       </w:pPr>
       <w:r>
-        <w:t>Rigour (simulator evidence: screenshots, Excel, numbers).</w:t>
+        <w:t>Rigour — evidence inside the simulator (drag results, screenshots, numbers).</w:t>
       </w:r>
     </w:p>
     <w:p>
@@ -1399,7 +1399,7 @@
         <w:pStyle w:val="ListBullet"/>
       </w:pPr>
       <w:r>
-        <w:t>Integration of competition + WTP + psychological factors.</w:t>
+        <w:t>Integration of competition + WTP + psychological factors into a single recommendation.</w:t>
       </w:r>
     </w:p>
     <w:p>
@@ -1407,7 +1407,7 @@
         <w:pStyle w:val="ListBullet"/>
       </w:pPr>
       <w:r>
-        <w:t>Clarity &amp; brevity — numbers justified, trade-offs explicit.</w:t>
+        <w:t>Clarity and brevity — numbers justified, trade-offs explicit.</w:t>
       </w:r>
     </w:p>
     <w:p>
@@ -1415,7 +1415,7 @@
         <w:pStyle w:val="ListBullet"/>
       </w:pPr>
       <w:r>
-        <w:t>Attached Excel export with final prices, position, Case answers and chart images.</w:t>
+        <w:t>Case answers written inside the simulator before the Excel is downloaded.</w:t>
       </w:r>
     </w:p>
     <w:p>
@@ -1426,31 +1426,76 @@
         <w:rPr>
           <w:color w:val="0F172A"/>
         </w:rPr>
-        <w:t>Entregables · Deliverables</w:t>
+        <w:t>Deliverable</w:t>
+      </w:r>
+    </w:p>
+    <w:p>
+      <w:r>
+        <w:rPr>
+          <w:b w:val="0"/>
+          <w:i w:val="0"/>
+          <w:sz w:val="22"/>
+        </w:rPr>
+        <w:t>The Excel (.xlsx) downloaded from the simulator is enough. Submit that file alone — it already contains every piece of evidence required:</w:t>
       </w:r>
     </w:p>
     <w:p>
       <w:pPr>
-        <w:pStyle w:val="ListNumber"/>
+        <w:pStyle w:val="ListBullet"/>
       </w:pPr>
       <w:r>
-        <w:t>This workbook (Word), every answer box filled in — OR case answers written inside the simulator.</w:t>
+        <w:t>Guide — case background, data note and active view.</w:t>
       </w:r>
     </w:p>
     <w:p>
       <w:pPr>
-        <w:pStyle w:val="ListNumber"/>
+        <w:pStyle w:val="ListBullet"/>
       </w:pPr>
       <w:r>
-        <w:t>The Excel (.xlsx) downloaded from the simulator — Guide, Questions, Answers (Day/Weekend/Week), Position, Case answers, Charts.</w:t>
+        <w:t>Questions — the 13 survey items (reference only).</w:t>
       </w:r>
     </w:p>
     <w:p>
       <w:pPr>
-        <w:pStyle w:val="ListNumber"/>
+        <w:pStyle w:val="ListBullet"/>
       </w:pPr>
       <w:r>
-        <w:t>A one-page executive summary.</w:t>
+        <w:t>Answers — Day / Weekend / Week — aggregated WTP distributions.</w:t>
+      </w:r>
+    </w:p>
+    <w:p>
+      <w:pPr>
+        <w:pStyle w:val="ListBullet"/>
+      </w:pPr>
+      <w:r>
+        <w:t>Position — your final prices, competitor prices, peak / gap / acceptance KPIs and the analyst note.</w:t>
+      </w:r>
+    </w:p>
+    <w:p>
+      <w:pPr>
+        <w:pStyle w:val="ListBullet"/>
+      </w:pPr>
+      <w:r>
+        <w:t>Case answers — your written answers to the three formal questions.</w:t>
+      </w:r>
+    </w:p>
+    <w:p>
+      <w:pPr>
+        <w:pStyle w:val="ListBullet"/>
+      </w:pPr>
+      <w:r>
+        <w:t>Charts — the nine simulator charts embedded as images.</w:t>
+      </w:r>
+    </w:p>
+    <w:p>
+      <w:r>
+        <w:rPr>
+          <w:b w:val="0"/>
+          <w:i/>
+          <w:color w:val="64748B"/>
+          <w:sz w:val="22"/>
+        </w:rPr>
+        <w:t>Before downloading, make sure you have filled the three Case answers and set the final prices in Position &amp; prices. No additional Word or PowerPoint file is required.</w:t>
       </w:r>
     </w:p>
     <w:p>
@@ -1466,7 +1511,7 @@
         <w:rPr>
           <w:color w:val="0F172A"/>
         </w:rPr>
-        <w:t>Anexo · Appendix — The 13 survey questions (reference)</w:t>
+        <w:t>Appendix — The 13 survey questions (reference only)</w:t>
       </w:r>
     </w:p>
     <w:p>
@@ -1477,7 +1522,7 @@
           <w:color w:val="64748B"/>
           <w:sz w:val="22"/>
         </w:rPr>
-        <w:t>These are the 13 items asked to the 95 survey respondents. They appear here for reference so that you can interpret the aggregated WTP distribution displayed by the simulator. You are NOT asked to answer them yourself.</w:t>
+        <w:t>These are the 13 items asked to the 95 survey respondents. They appear here only as reference so that you can interpret the aggregated WTP distribution displayed by the simulator. You are NOT asked to answer them yourself. Original Spanish wording in italics.</w:t>
       </w:r>
     </w:p>
     <w:p>
@@ -1488,6 +1533,16 @@
         <w:t xml:space="preserve">Q1. </w:t>
       </w:r>
       <w:r>
+        <w:t>Please indicate your gender.</w:t>
+      </w:r>
+    </w:p>
+    <w:p>
+      <w:r>
+        <w:rPr>
+          <w:i/>
+          <w:color w:val="64748B"/>
+          <w:sz w:val="20"/>
+        </w:rPr>
         <w:t>Por favor, indique su género.</w:t>
       </w:r>
     </w:p>
@@ -1499,7 +1554,17 @@
         <w:t xml:space="preserve">Q2. </w:t>
       </w:r>
       <w:r>
-        <w:t>¿En qué rango de edad se encuentra?  &lt;20 / 20-30 / 30-40 / 40-50 / 50-60 / &gt;60</w:t>
+        <w:t>What age range are you in?  &lt;20 / 20-30 / 30-40 / 40-50 / 50-60 / &gt;60</w:t>
+      </w:r>
+    </w:p>
+    <w:p>
+      <w:r>
+        <w:rPr>
+          <w:i/>
+          <w:color w:val="64748B"/>
+          <w:sz w:val="20"/>
+        </w:rPr>
+        <w:t>¿En qué rango de edad se encuentra?</w:t>
       </w:r>
     </w:p>
     <w:p>
@@ -1510,7 +1575,17 @@
         <w:t xml:space="preserve">Q3. </w:t>
       </w:r>
       <w:r>
-        <w:t>¿Cuál es su estado civil?  Soltero / Casado / Divorciado / Viudo</w:t>
+        <w:t>What is your civil status?  Single / Married / Divorced / Widowed</w:t>
+      </w:r>
+    </w:p>
+    <w:p>
+      <w:r>
+        <w:rPr>
+          <w:i/>
+          <w:color w:val="64748B"/>
+          <w:sz w:val="20"/>
+        </w:rPr>
+        <w:t>¿Cuál es su estado civil?</w:t>
       </w:r>
     </w:p>
     <w:p>
@@ -1521,7 +1596,17 @@
         <w:t xml:space="preserve">Q4. </w:t>
       </w:r>
       <w:r>
-        <w:t>¿Cuál es su nivel de educación?  Primaria / Secundaria / Grado / Máster o Posgrado</w:t>
+        <w:t>What is your level of education?  Primary / Secondary / University / Master or PhD</w:t>
+      </w:r>
+    </w:p>
+    <w:p>
+      <w:r>
+        <w:rPr>
+          <w:i/>
+          <w:color w:val="64748B"/>
+          <w:sz w:val="20"/>
+        </w:rPr>
+        <w:t>¿Cuál es su nivel de educación?</w:t>
       </w:r>
     </w:p>
     <w:p>
@@ -1532,7 +1617,17 @@
         <w:t xml:space="preserve">Q5. </w:t>
       </w:r>
       <w:r>
-        <w:t>Seleccione su situación laboral.  Empleado / Autónomo / Desempleado / Jubilado / Estudiante</w:t>
+        <w:t>Select your employment status.  Employed / Self-employed / Unemployed / Retired / Student</w:t>
+      </w:r>
+    </w:p>
+    <w:p>
+      <w:r>
+        <w:rPr>
+          <w:i/>
+          <w:color w:val="64748B"/>
+          <w:sz w:val="20"/>
+        </w:rPr>
+        <w:t>Seleccione su situación laboral.</w:t>
       </w:r>
     </w:p>
     <w:p>
@@ -1543,7 +1638,17 @@
         <w:t xml:space="preserve">Q6. </w:t>
       </w:r>
       <w:r>
-        <w:t>¿Qué le gusta hacer en su tiempo libre? (Multi-select)  Viajar · Leer · Deporte · Aventura · Familia · Otras</w:t>
+        <w:t>What do you like to do in your free time? (multiple choice)  Travel · Reading · Sports · Adventure · Family time · Other</w:t>
+      </w:r>
+    </w:p>
+    <w:p>
+      <w:r>
+        <w:rPr>
+          <w:i/>
+          <w:color w:val="64748B"/>
+          <w:sz w:val="20"/>
+        </w:rPr>
+        <w:t>¿Qué le gusta hacer en su tiempo libre?</w:t>
       </w:r>
     </w:p>
     <w:p>
@@ -1554,7 +1659,17 @@
         <w:t xml:space="preserve">Q7. </w:t>
       </w:r>
       <w:r>
-        <w:t>¿Cuántos días sueles irte de vacaciones?  &lt;3 / 3-5 / 5-7 / &gt;7</w:t>
+        <w:t>How many days do you usually go on vacation?  &lt;3 / 3-5 / 5-7 / &gt;7</w:t>
+      </w:r>
+    </w:p>
+    <w:p>
+      <w:r>
+        <w:rPr>
+          <w:i/>
+          <w:color w:val="64748B"/>
+          <w:sz w:val="20"/>
+        </w:rPr>
+        <w:t>¿Cuántos días sueles irte de vacaciones?</w:t>
       </w:r>
     </w:p>
     <w:p>
@@ -1565,7 +1680,17 @@
         <w:t xml:space="preserve">Q8. </w:t>
       </w:r>
       <w:r>
-        <w:t>Precio máximo dispuesto a pagar — camper ESTÁNDAR al día.</w:t>
+        <w:t>Maximum price you are willing to pay — STANDARD camper, per day.</w:t>
+      </w:r>
+    </w:p>
+    <w:p>
+      <w:r>
+        <w:rPr>
+          <w:i/>
+          <w:color w:val="64748B"/>
+          <w:sz w:val="20"/>
+        </w:rPr>
+        <w:t>Precio máximo por el alquiler de una camper ESTÁNDAR al día.</w:t>
       </w:r>
     </w:p>
     <w:p>
@@ -1576,7 +1701,17 @@
         <w:t xml:space="preserve">Q9. </w:t>
       </w:r>
       <w:r>
-        <w:t>Precio máximo dispuesto a pagar — camper ESTÁNDAR fin de semana (2 noches).</w:t>
+        <w:t>Maximum price you are willing to pay — STANDARD camper, weekend (2 nights).</w:t>
+      </w:r>
+    </w:p>
+    <w:p>
+      <w:r>
+        <w:rPr>
+          <w:i/>
+          <w:color w:val="64748B"/>
+          <w:sz w:val="20"/>
+        </w:rPr>
+        <w:t>Precio máximo — camper ESTÁNDAR fin de semana (2 noches).</w:t>
       </w:r>
     </w:p>
     <w:p>
@@ -1587,7 +1722,17 @@
         <w:t xml:space="preserve">Q10. </w:t>
       </w:r>
       <w:r>
-        <w:t>Precio máximo dispuesto a pagar — camper ESTÁNDAR semana (6 noches).</w:t>
+        <w:t>Maximum price you are willing to pay — STANDARD camper, week (6 nights).</w:t>
+      </w:r>
+    </w:p>
+    <w:p>
+      <w:r>
+        <w:rPr>
+          <w:i/>
+          <w:color w:val="64748B"/>
+          <w:sz w:val="20"/>
+        </w:rPr>
+        <w:t>Precio máximo — camper ESTÁNDAR semana (6 noches).</w:t>
       </w:r>
     </w:p>
     <w:p>
@@ -1598,7 +1743,17 @@
         <w:t xml:space="preserve">Q11. </w:t>
       </w:r>
       <w:r>
-        <w:t>Precio máximo dispuesto a pagar — camper PREMIUM al día.</w:t>
+        <w:t>Maximum price you are willing to pay — PREMIUM camper, per day.</w:t>
+      </w:r>
+    </w:p>
+    <w:p>
+      <w:r>
+        <w:rPr>
+          <w:i/>
+          <w:color w:val="64748B"/>
+          <w:sz w:val="20"/>
+        </w:rPr>
+        <w:t>Precio máximo — camper PREMIUM al día.</w:t>
       </w:r>
     </w:p>
     <w:p>
@@ -1609,7 +1764,17 @@
         <w:t xml:space="preserve">Q12. </w:t>
       </w:r>
       <w:r>
-        <w:t>Precio máximo dispuesto a pagar — camper PREMIUM fin de semana (2 noches).</w:t>
+        <w:t>Maximum price you are willing to pay — PREMIUM camper, weekend (2 nights).</w:t>
+      </w:r>
+    </w:p>
+    <w:p>
+      <w:r>
+        <w:rPr>
+          <w:i/>
+          <w:color w:val="64748B"/>
+          <w:sz w:val="20"/>
+        </w:rPr>
+        <w:t>Precio máximo — camper PREMIUM fin de semana (2 noches).</w:t>
       </w:r>
     </w:p>
     <w:p>
@@ -1620,7 +1785,17 @@
         <w:t xml:space="preserve">Q13. </w:t>
       </w:r>
       <w:r>
-        <w:t>Precio máximo dispuesto a pagar — camper PREMIUM semana (6 noches).</w:t>
+        <w:t>Maximum price you are willing to pay — PREMIUM camper, week (6 nights).</w:t>
+      </w:r>
+    </w:p>
+    <w:p>
+      <w:r>
+        <w:rPr>
+          <w:i/>
+          <w:color w:val="64748B"/>
+          <w:sz w:val="20"/>
+        </w:rPr>
+        <w:t>Precio máximo — camper PREMIUM semana (6 noches).</w:t>
       </w:r>
     </w:p>
     <w:sectPr>

</xml_diff>